<commit_message>
Yhorm the Giant | Add documentation docs in german and english
</commit_message>
<xml_diff>
--- a/Diplomarbeit/doc/HTL-DA-Doku-DE.docx
+++ b/Diplomarbeit/doc/HTL-DA-Doku-DE.docx
@@ -1,6 +1,6 @@
 
 <file path=word/document.xml><?xml version="1.0" encoding="utf-8"?>
-<w:document xmlns:wpc="http://schemas.microsoft.com/office/word/2010/wordprocessingCanvas" xmlns:cx="http://schemas.microsoft.com/office/drawing/2014/chartex" xmlns:cx1="http://schemas.microsoft.com/office/drawing/2015/9/8/chartex" xmlns:cx2="http://schemas.microsoft.com/office/drawing/2015/10/21/chartex" xmlns:cx3="http://schemas.microsoft.com/office/drawing/2016/5/9/chartex" xmlns:cx4="http://schemas.microsoft.com/office/drawing/2016/5/10/chartex" xmlns:cx5="http://schemas.microsoft.com/office/drawing/2016/5/11/chartex" xmlns:cx6="http://schemas.microsoft.com/office/drawing/2016/5/12/chartex" xmlns:cx7="http://schemas.microsoft.com/office/drawing/2016/5/13/chartex" xmlns:cx8="http://schemas.microsoft.com/office/drawing/2016/5/14/chartex" xmlns:mc="http://schemas.openxmlformats.org/markup-compatibility/2006" xmlns:aink="http://schemas.microsoft.com/office/drawing/2016/ink" xmlns:am3d="http://schemas.microsoft.com/office/drawing/2017/model3d" xmlns:o="urn:schemas-microsoft-com:office:office" xmlns:r="http://schemas.openxmlformats.org/officeDocument/2006/relationships" xmlns:m="http://schemas.openxmlformats.org/officeDocument/2006/math" xmlns:v="urn:schemas-microsoft-com:vml" xmlns:wp14="http://schemas.microsoft.com/office/word/2010/wordprocessingDrawing" xmlns:wp="http://schemas.openxmlformats.org/drawingml/2006/wordprocessingDrawing" xmlns:w10="urn:schemas-microsoft-com:office:word" xmlns:w="http://schemas.openxmlformats.org/wordprocessingml/2006/main" xmlns:w14="http://schemas.microsoft.com/office/word/2010/wordml" xmlns:w15="http://schemas.microsoft.com/office/word/2012/wordml" xmlns:w16cid="http://schemas.microsoft.com/office/word/2016/wordml/cid" xmlns:w16se="http://schemas.microsoft.com/office/word/2015/wordml/symex" xmlns:wpg="http://schemas.microsoft.com/office/word/2010/wordprocessingGroup" xmlns:wpi="http://schemas.microsoft.com/office/word/2010/wordprocessingInk" xmlns:wne="http://schemas.microsoft.com/office/word/2006/wordml" xmlns:wps="http://schemas.microsoft.com/office/word/2010/wordprocessingShape" mc:Ignorable="w14 w15 w16se w16cid wp14">
+<w:document xmlns:wpc="http://schemas.microsoft.com/office/word/2010/wordprocessingCanvas" xmlns:cx="http://schemas.microsoft.com/office/drawing/2014/chartex" xmlns:cx1="http://schemas.microsoft.com/office/drawing/2015/9/8/chartex" xmlns:cx2="http://schemas.microsoft.com/office/drawing/2015/10/21/chartex" xmlns:cx3="http://schemas.microsoft.com/office/drawing/2016/5/9/chartex" xmlns:cx4="http://schemas.microsoft.com/office/drawing/2016/5/10/chartex" xmlns:cx5="http://schemas.microsoft.com/office/drawing/2016/5/11/chartex" xmlns:cx6="http://schemas.microsoft.com/office/drawing/2016/5/12/chartex" xmlns:cx7="http://schemas.microsoft.com/office/drawing/2016/5/13/chartex" xmlns:cx8="http://schemas.microsoft.com/office/drawing/2016/5/14/chartex" xmlns:mc="http://schemas.openxmlformats.org/markup-compatibility/2006" xmlns:aink="http://schemas.microsoft.com/office/drawing/2016/ink" xmlns:am3d="http://schemas.microsoft.com/office/drawing/2017/model3d" xmlns:o="urn:schemas-microsoft-com:office:office" xmlns:oel="http://schemas.microsoft.com/office/2019/extlst" xmlns:r="http://schemas.openxmlformats.org/officeDocument/2006/relationships" xmlns:m="http://schemas.openxmlformats.org/officeDocument/2006/math" xmlns:v="urn:schemas-microsoft-com:vml" xmlns:wp14="http://schemas.microsoft.com/office/word/2010/wordprocessingDrawing" xmlns:wp="http://schemas.openxmlformats.org/drawingml/2006/wordprocessingDrawing" xmlns:w10="urn:schemas-microsoft-com:office:word" xmlns:w="http://schemas.openxmlformats.org/wordprocessingml/2006/main" xmlns:w14="http://schemas.microsoft.com/office/word/2010/wordml" xmlns:w15="http://schemas.microsoft.com/office/word/2012/wordml" xmlns:w16cex="http://schemas.microsoft.com/office/word/2018/wordml/cex" xmlns:w16cid="http://schemas.microsoft.com/office/word/2016/wordml/cid" xmlns:w16="http://schemas.microsoft.com/office/word/2018/wordml" xmlns:w16du="http://schemas.microsoft.com/office/word/2023/wordml/word16du" xmlns:w16sdtdh="http://schemas.microsoft.com/office/word/2020/wordml/sdtdatahash" xmlns:w16sdtfl="http://schemas.microsoft.com/office/word/2024/wordml/sdtformatlock" xmlns:w16se="http://schemas.microsoft.com/office/word/2015/wordml/symex" xmlns:wpg="http://schemas.microsoft.com/office/word/2010/wordprocessingGroup" xmlns:wpi="http://schemas.microsoft.com/office/word/2010/wordprocessingInk" xmlns:wne="http://schemas.microsoft.com/office/word/2006/wordml" xmlns:wps="http://schemas.microsoft.com/office/word/2010/wordprocessingShape" mc:Ignorable="w14 w15 w16se w16cid w16 w16cex w16sdtdh w16sdtfl w16du wp14">
   <w:body>
     <w:p>
       <w:pPr>
@@ -129,15 +129,46 @@
                 <w:rFonts w:ascii="Arial" w:hAnsi="Arial" w:cs="Arial"/>
                 <w:sz w:val="22"/>
                 <w:szCs w:val="22"/>
-              </w:rPr>
-            </w:pPr>
-            <w:r>
-              <w:rPr>
-                <w:rFonts w:ascii="Arial" w:hAnsi="Arial" w:cs="Arial"/>
-                <w:sz w:val="22"/>
-                <w:szCs w:val="22"/>
-              </w:rPr>
-              <w:t>Name 1, Name 2</w:t>
+                <w:lang w:val="de-AT"/>
+              </w:rPr>
+            </w:pPr>
+            <w:r>
+              <w:rPr>
+                <w:rFonts w:ascii="Arial" w:hAnsi="Arial" w:cs="Arial"/>
+                <w:sz w:val="22"/>
+                <w:szCs w:val="22"/>
+                <w:lang w:val="de-AT"/>
+              </w:rPr>
+              <w:t xml:space="preserve">Luan </w:t>
+            </w:r>
+            <w:proofErr w:type="spellStart"/>
+            <w:r>
+              <w:rPr>
+                <w:rFonts w:ascii="Arial" w:hAnsi="Arial" w:cs="Arial"/>
+                <w:sz w:val="22"/>
+                <w:szCs w:val="22"/>
+                <w:lang w:val="de-AT"/>
+              </w:rPr>
+              <w:t>Lanzmaier</w:t>
+            </w:r>
+            <w:proofErr w:type="spellEnd"/>
+            <w:r>
+              <w:rPr>
+                <w:rFonts w:ascii="Arial" w:hAnsi="Arial" w:cs="Arial"/>
+                <w:sz w:val="22"/>
+                <w:szCs w:val="22"/>
+                <w:lang w:val="de-AT"/>
+              </w:rPr>
+              <w:t>, André Rath, Nikita Sch</w:t>
+            </w:r>
+            <w:r>
+              <w:rPr>
+                <w:rFonts w:ascii="Arial" w:hAnsi="Arial" w:cs="Arial"/>
+                <w:sz w:val="22"/>
+                <w:szCs w:val="22"/>
+                <w:lang w:val="de-AT"/>
+              </w:rPr>
+              <w:t>aar</w:t>
             </w:r>
           </w:p>
         </w:tc>
@@ -244,34 +275,8 @@
                 <w:sz w:val="22"/>
                 <w:szCs w:val="22"/>
               </w:rPr>
-              <w:t>2</w:t>
-            </w:r>
-            <w:r>
-              <w:rPr>
-                <w:rFonts w:ascii="Arial" w:hAnsi="Arial" w:cs="Arial"/>
-                <w:sz w:val="22"/>
-                <w:szCs w:val="22"/>
-              </w:rPr>
-              <w:t>/</w:t>
-            </w:r>
-            <w:r>
-              <w:rPr>
-                <w:rFonts w:ascii="Arial" w:hAnsi="Arial" w:cs="Arial"/>
-                <w:sz w:val="22"/>
-                <w:szCs w:val="22"/>
-              </w:rPr>
-              <w:t>2</w:t>
-            </w:r>
-            <w:r>
-              <w:rPr>
-                <w:rFonts w:ascii="Arial" w:hAnsi="Arial" w:cs="Arial"/>
-                <w:sz w:val="22"/>
-                <w:szCs w:val="22"/>
-              </w:rPr>
-              <w:t>3</w:t>
-            </w:r>
-            <w:bookmarkStart w:id="0" w:name="_GoBack"/>
-            <w:bookmarkEnd w:id="0"/>
+              <w:t>5/26</w:t>
+            </w:r>
           </w:p>
         </w:tc>
       </w:tr>
@@ -339,46 +344,34 @@
                 <w:szCs w:val="22"/>
               </w:rPr>
             </w:pPr>
-            <w:r>
-              <w:rPr>
-                <w:rFonts w:ascii="Arial" w:hAnsi="Arial" w:cs="Arial"/>
-                <w:sz w:val="22"/>
-                <w:szCs w:val="22"/>
-              </w:rPr>
-              <w:t>Entwurf ei</w:t>
-            </w:r>
-            <w:r>
-              <w:rPr>
-                <w:rFonts w:ascii="Arial" w:hAnsi="Arial" w:cs="Arial"/>
-                <w:sz w:val="22"/>
-                <w:szCs w:val="22"/>
-              </w:rPr>
-              <w:t>nes Versuchsstandes für Kreisel</w:t>
-            </w:r>
-            <w:r>
-              <w:rPr>
-                <w:rFonts w:ascii="Arial" w:hAnsi="Arial" w:cs="Arial"/>
-                <w:sz w:val="22"/>
-                <w:szCs w:val="22"/>
-              </w:rPr>
-              <w:t xml:space="preserve">pumpen, welcher in </w:t>
-            </w:r>
-            <w:r>
-              <w:rPr>
-                <w:rFonts w:ascii="Arial" w:hAnsi="Arial" w:cs="Arial"/>
-                <w:sz w:val="22"/>
-                <w:szCs w:val="22"/>
-              </w:rPr>
-              <w:t>ebener</w:t>
-            </w:r>
-            <w:r>
-              <w:rPr>
-                <w:rFonts w:ascii="Arial" w:hAnsi="Arial" w:cs="Arial"/>
-                <w:sz w:val="22"/>
-                <w:szCs w:val="22"/>
-              </w:rPr>
-              <w:t xml:space="preserve"> Ausführung verbaut wird</w:t>
-            </w:r>
+            <w:proofErr w:type="spellStart"/>
+            <w:r>
+              <w:rPr>
+                <w:rFonts w:ascii="Arial" w:hAnsi="Arial" w:cs="Arial"/>
+                <w:sz w:val="22"/>
+                <w:szCs w:val="22"/>
+              </w:rPr>
+              <w:t>DigiKicker</w:t>
+            </w:r>
+            <w:proofErr w:type="spellEnd"/>
+            <w:r>
+              <w:rPr>
+                <w:rFonts w:ascii="Arial" w:hAnsi="Arial" w:cs="Arial"/>
+                <w:sz w:val="22"/>
+                <w:szCs w:val="22"/>
+              </w:rPr>
+              <w:t xml:space="preserve"> - Digitalisierung eines </w:t>
+            </w:r>
+            <w:proofErr w:type="spellStart"/>
+            <w:r>
+              <w:rPr>
+                <w:rFonts w:ascii="Arial" w:hAnsi="Arial" w:cs="Arial"/>
+                <w:sz w:val="22"/>
+                <w:szCs w:val="22"/>
+              </w:rPr>
+              <w:t>Tischfussballtisches</w:t>
+            </w:r>
+            <w:proofErr w:type="spellEnd"/>
           </w:p>
         </w:tc>
       </w:tr>
@@ -456,8 +449,25 @@
                 <w:rFonts w:ascii="Arial" w:hAnsi="Arial" w:cs="Arial"/>
                 <w:sz w:val="22"/>
                 <w:szCs w:val="22"/>
-              </w:rPr>
-            </w:pPr>
+                <w:lang w:val="en-US"/>
+              </w:rPr>
+            </w:pPr>
+            <w:r>
+              <w:rPr>
+                <w:rFonts w:ascii="Arial" w:hAnsi="Arial" w:cs="Arial"/>
+                <w:sz w:val="22"/>
+                <w:szCs w:val="22"/>
+              </w:rPr>
+              <w:t>Hardwareentwicklung</w:t>
+            </w:r>
+            <w:r>
+              <w:rPr>
+                <w:rFonts w:ascii="Arial" w:hAnsi="Arial" w:cs="Arial"/>
+                <w:sz w:val="22"/>
+                <w:szCs w:val="22"/>
+              </w:rPr>
+              <w:t>, Nikita Schaar, 5AHWIN</w:t>
+            </w:r>
           </w:p>
         </w:tc>
       </w:tr>
@@ -477,6 +487,7 @@
                 <w:rFonts w:ascii="Arial" w:hAnsi="Arial" w:cs="Arial"/>
                 <w:sz w:val="22"/>
                 <w:szCs w:val="22"/>
+                <w:lang w:val="en-US"/>
               </w:rPr>
             </w:pPr>
           </w:p>
@@ -492,8 +503,25 @@
                 <w:rFonts w:ascii="Arial" w:hAnsi="Arial" w:cs="Arial"/>
                 <w:sz w:val="22"/>
                 <w:szCs w:val="22"/>
-              </w:rPr>
-            </w:pPr>
+                <w:lang w:val="en-US"/>
+              </w:rPr>
+            </w:pPr>
+            <w:r>
+              <w:rPr>
+                <w:rFonts w:ascii="Arial" w:hAnsi="Arial" w:cs="Arial"/>
+                <w:sz w:val="22"/>
+                <w:szCs w:val="22"/>
+              </w:rPr>
+              <w:t>Simulationsentwicklung</w:t>
+            </w:r>
+            <w:r>
+              <w:rPr>
+                <w:rFonts w:ascii="Arial" w:hAnsi="Arial" w:cs="Arial"/>
+                <w:sz w:val="22"/>
+                <w:szCs w:val="22"/>
+              </w:rPr>
+              <w:t>, André Rath, 5AHWIN</w:t>
+            </w:r>
           </w:p>
         </w:tc>
       </w:tr>
@@ -513,6 +541,7 @@
                 <w:rFonts w:ascii="Arial" w:hAnsi="Arial" w:cs="Arial"/>
                 <w:sz w:val="22"/>
                 <w:szCs w:val="22"/>
+                <w:lang w:val="en-US"/>
               </w:rPr>
             </w:pPr>
           </w:p>
@@ -528,8 +557,37 @@
                 <w:rFonts w:ascii="Arial" w:hAnsi="Arial" w:cs="Arial"/>
                 <w:sz w:val="22"/>
                 <w:szCs w:val="22"/>
-              </w:rPr>
-            </w:pPr>
+                <w:lang w:val="en-US"/>
+              </w:rPr>
+            </w:pPr>
+            <w:r>
+              <w:rPr>
+                <w:rFonts w:ascii="Arial" w:hAnsi="Arial" w:cs="Arial"/>
+                <w:sz w:val="22"/>
+                <w:szCs w:val="22"/>
+                <w:lang w:val="en-US"/>
+              </w:rPr>
+              <w:t>Multiplayer-Implementation &amp; Graphical Design,</w:t>
+            </w:r>
+          </w:p>
+          <w:p>
+            <w:pPr>
+              <w:rPr>
+                <w:rFonts w:ascii="Arial" w:hAnsi="Arial" w:cs="Arial"/>
+                <w:sz w:val="22"/>
+                <w:szCs w:val="22"/>
+                <w:lang w:val="en-US"/>
+              </w:rPr>
+            </w:pPr>
+            <w:r>
+              <w:rPr>
+                <w:rFonts w:ascii="Arial" w:hAnsi="Arial" w:cs="Arial"/>
+                <w:sz w:val="22"/>
+                <w:szCs w:val="22"/>
+                <w:lang w:val="en-US"/>
+              </w:rPr>
+              <w:t>Luan Lanzmaier, 5BHWIN</w:t>
+            </w:r>
           </w:p>
         </w:tc>
       </w:tr>
@@ -587,23 +645,7 @@
                 <w:sz w:val="22"/>
                 <w:szCs w:val="22"/>
               </w:rPr>
-              <w:t>voest</w:t>
-            </w:r>
-            <w:r>
-              <w:rPr>
-                <w:rFonts w:ascii="Arial" w:hAnsi="Arial" w:cs="Arial"/>
-                <w:sz w:val="22"/>
-                <w:szCs w:val="22"/>
-              </w:rPr>
-              <w:t>alpine</w:t>
-            </w:r>
-            <w:r>
-              <w:rPr>
-                <w:rFonts w:ascii="Arial" w:hAnsi="Arial" w:cs="Arial"/>
-                <w:sz w:val="22"/>
-                <w:szCs w:val="22"/>
-              </w:rPr>
-              <w:t xml:space="preserve"> Schienen GmbH, Donawitz</w:t>
+              <w:t>HTL Leoben</w:t>
             </w:r>
           </w:p>
         </w:tc>
@@ -648,6 +690,40 @@
                 <w:szCs w:val="22"/>
               </w:rPr>
             </w:pPr>
+            <w:r>
+              <w:rPr>
+                <w:rFonts w:ascii="Arial" w:hAnsi="Arial" w:cs="Arial"/>
+                <w:sz w:val="22"/>
+                <w:szCs w:val="22"/>
+              </w:rPr>
+              <w:t xml:space="preserve">DI (FH) Günther Hutter, </w:t>
+            </w:r>
+            <w:proofErr w:type="spellStart"/>
+            <w:r>
+              <w:rPr>
+                <w:rFonts w:ascii="Arial" w:hAnsi="Arial" w:cs="Arial"/>
+                <w:sz w:val="22"/>
+                <w:szCs w:val="22"/>
+              </w:rPr>
+              <w:t>MSc</w:t>
+            </w:r>
+            <w:proofErr w:type="spellEnd"/>
+            <w:r>
+              <w:rPr>
+                <w:rFonts w:ascii="Arial" w:hAnsi="Arial" w:cs="Arial"/>
+                <w:sz w:val="22"/>
+                <w:szCs w:val="22"/>
+              </w:rPr>
+              <w:t xml:space="preserve">., </w:t>
+            </w:r>
+            <w:r>
+              <w:rPr>
+                <w:rFonts w:ascii="Arial" w:hAnsi="Arial" w:cs="Arial"/>
+                <w:sz w:val="22"/>
+                <w:szCs w:val="22"/>
+              </w:rPr>
+              <w:t>DI Dr. Thomas Messner</w:t>
+            </w:r>
           </w:p>
         </w:tc>
       </w:tr>
@@ -714,29 +790,18 @@
             <w:pPr>
               <w:rPr>
                 <w:rFonts w:ascii="Arial" w:hAnsi="Arial" w:cs="Arial"/>
-              </w:rPr>
-            </w:pPr>
-          </w:p>
-          <w:p>
-            <w:pPr>
-              <w:rPr>
-                <w:rFonts w:ascii="Arial" w:hAnsi="Arial" w:cs="Arial"/>
-              </w:rPr>
-            </w:pPr>
-          </w:p>
-          <w:p>
-            <w:pPr>
-              <w:rPr>
-                <w:rFonts w:ascii="Arial" w:hAnsi="Arial" w:cs="Arial"/>
-              </w:rPr>
-            </w:pPr>
-          </w:p>
-          <w:p>
-            <w:pPr>
-              <w:rPr>
-                <w:rFonts w:ascii="Arial" w:hAnsi="Arial" w:cs="Arial"/>
-              </w:rPr>
-            </w:pPr>
+                <w:sz w:val="22"/>
+                <w:szCs w:val="22"/>
+              </w:rPr>
+            </w:pPr>
+            <w:r>
+              <w:rPr>
+                <w:rFonts w:ascii="Arial" w:hAnsi="Arial" w:cs="Arial"/>
+                <w:sz w:val="22"/>
+                <w:szCs w:val="22"/>
+              </w:rPr>
+              <w:t>Die Schaffung eines funktionierenden Controllers zur Steuerung einer eigens entwickelten Simulation eines Tischfußballtisches, welcher eine Mehrspieler-Funktion aufweist und sowohl on- als auch offline spielbar ist.</w:t>
+            </w:r>
           </w:p>
           <w:p>
             <w:pPr>
@@ -828,20 +893,12 @@
                 <w:rFonts w:ascii="Arial" w:hAnsi="Arial" w:cs="Arial"/>
               </w:rPr>
             </w:pPr>
-          </w:p>
-          <w:p>
-            <w:pPr>
-              <w:rPr>
-                <w:rFonts w:ascii="Arial" w:hAnsi="Arial" w:cs="Arial"/>
-              </w:rPr>
-            </w:pPr>
-          </w:p>
-          <w:p>
-            <w:pPr>
-              <w:rPr>
-                <w:rFonts w:ascii="Arial" w:hAnsi="Arial" w:cs="Arial"/>
-              </w:rPr>
-            </w:pPr>
+            <w:r>
+              <w:rPr>
+                <w:rFonts w:ascii="Arial" w:hAnsi="Arial" w:cs="Arial"/>
+              </w:rPr>
+              <w:t>Fertigstellung ohne Korrektur bis Anfang Jänner 2026</w:t>
+            </w:r>
           </w:p>
           <w:p>
             <w:pPr>
@@ -883,6 +940,7 @@
           </w:tcPr>
           <w:p>
             <w:pPr>
+              <w:jc w:val="center"/>
               <w:rPr>
                 <w:rFonts w:ascii="Arial" w:hAnsi="Arial" w:cs="Arial"/>
                 <w:sz w:val="22"/>
@@ -914,77 +972,129 @@
           </w:tcPr>
           <w:p>
             <w:pPr>
-              <w:rPr>
-                <w:rFonts w:ascii="Arial" w:hAnsi="Arial" w:cs="Arial"/>
-              </w:rPr>
-            </w:pPr>
-          </w:p>
-          <w:p>
-            <w:pPr>
-              <w:rPr>
-                <w:rFonts w:ascii="Arial" w:hAnsi="Arial" w:cs="Arial"/>
-              </w:rPr>
-            </w:pPr>
-          </w:p>
-          <w:p>
-            <w:pPr>
-              <w:rPr>
-                <w:rFonts w:ascii="Arial" w:hAnsi="Arial" w:cs="Arial"/>
-              </w:rPr>
-            </w:pPr>
-          </w:p>
-          <w:p>
-            <w:pPr>
-              <w:rPr>
-                <w:rFonts w:ascii="Arial" w:hAnsi="Arial" w:cs="Arial"/>
-              </w:rPr>
-            </w:pPr>
-          </w:p>
-          <w:p>
-            <w:pPr>
-              <w:rPr>
-                <w:rFonts w:ascii="Arial" w:hAnsi="Arial" w:cs="Arial"/>
-              </w:rPr>
-            </w:pPr>
-          </w:p>
-          <w:p>
-            <w:pPr>
-              <w:rPr>
-                <w:rFonts w:ascii="Arial" w:hAnsi="Arial" w:cs="Arial"/>
-              </w:rPr>
-            </w:pPr>
-          </w:p>
-          <w:p>
-            <w:pPr>
-              <w:rPr>
-                <w:rFonts w:ascii="Arial" w:hAnsi="Arial" w:cs="Arial"/>
-              </w:rPr>
-            </w:pPr>
-          </w:p>
-          <w:p>
-            <w:pPr>
-              <w:rPr>
-                <w:rFonts w:ascii="Arial" w:hAnsi="Arial" w:cs="Arial"/>
-              </w:rPr>
-            </w:pPr>
-          </w:p>
-          <w:p>
-            <w:pPr>
-              <w:rPr>
-                <w:rFonts w:ascii="Arial" w:hAnsi="Arial" w:cs="Arial"/>
+              <w:jc w:val="center"/>
+              <w:rPr>
+                <w:rFonts w:ascii="Arial" w:hAnsi="Arial" w:cs="Arial"/>
+              </w:rPr>
+            </w:pPr>
+          </w:p>
+          <w:p>
+            <w:pPr>
+              <w:rPr>
+                <w:rFonts w:ascii="Arial" w:hAnsi="Arial" w:cs="Arial"/>
+                <w:lang w:val="de-AT"/>
+              </w:rPr>
+            </w:pPr>
+            <w:r>
+              <w:rPr>
+                <w:rFonts w:ascii="Arial" w:hAnsi="Arial" w:cs="Arial"/>
+                <w:u w:val="single"/>
+                <w:lang w:val="de-AT"/>
+              </w:rPr>
+              <w:t>Schaar:</w:t>
+            </w:r>
+            <w:r>
+              <w:rPr>
+                <w:rFonts w:ascii="Arial" w:hAnsi="Arial" w:cs="Arial"/>
+                <w:lang w:val="de-AT"/>
+              </w:rPr>
+              <w:t xml:space="preserve"> Am Ende der Arbeit soll ein funktionsfähiger und ansprechend gestalteter Controller vorliegen, der mithilfe von CAD-Software entwickelt und in einem 3D-gedruckten Gehäuse verbaut wurde. Dieser basiert auf Mikrocontrollern und Sensoren, welche die Dreh- und Schiebebewegungen der Spielfiguren präzise erfassen. Die erfassten Daten werden über eine serielle Schnittstelle an einen Computer übertragen, wo sie zur Steuerung der Simulation verarbeitet werden. Dabei ist eine geringe Latenz entscheidend, um ein Spielerlebnis zu ermöglichen, das möglichst nah an Echtzeit liegt und somit den Anforderungen an ein reaktionsschnelles Spielverhalten gerecht wird.</w:t>
+            </w:r>
+          </w:p>
+          <w:p>
+            <w:pPr>
+              <w:jc w:val="center"/>
+              <w:rPr>
+                <w:rFonts w:ascii="Arial" w:hAnsi="Arial" w:cs="Arial"/>
+                <w:u w:val="single"/>
+                <w:lang w:val="de-AT"/>
+              </w:rPr>
+            </w:pPr>
+          </w:p>
+          <w:p>
+            <w:pPr>
+              <w:rPr>
+                <w:rFonts w:ascii="Arial" w:hAnsi="Arial" w:cs="Arial"/>
+                <w:lang w:val="de-AT"/>
+              </w:rPr>
+            </w:pPr>
+            <w:r>
+              <w:rPr>
+                <w:rFonts w:ascii="Arial" w:hAnsi="Arial" w:cs="Arial"/>
+                <w:u w:val="single"/>
+                <w:lang w:val="de-AT"/>
+              </w:rPr>
+              <w:t>Rath:</w:t>
+            </w:r>
+            <w:r>
+              <w:rPr>
+                <w:rFonts w:ascii="Arial" w:hAnsi="Arial" w:cs="Arial"/>
+                <w:lang w:val="de-AT"/>
+              </w:rPr>
+              <w:t xml:space="preserve"> Ziel ist die Entwicklung einer voll funktionsfähigen, interaktiven Simulation eines Tischfußballtisches, die Steuerbefehle in Echtzeit über eine Schnittstelle vom Controller übernimmt. Die digitale Simulation soll einen Mehrspieler-Modus bieten, in dem zwei Teams mit jeweils zwei Spielern gegeneinander antreten können. Zusätzlich wird ein Trainingsmodus integriert, in dem einzelne Spieler ihre </w:t>
+            </w:r>
+            <w:r>
+              <w:rPr>
+                <w:rFonts w:ascii="Arial" w:hAnsi="Arial" w:cs="Arial"/>
+                <w:lang w:val="de-AT"/>
+              </w:rPr>
+              <w:lastRenderedPageBreak/>
+              <w:t>Fähigkeiten gezielt verbessern können. Als ergänzendes Spielelement wird ein Minigame-Modus umgesetzt, der abwechslungsreiche Herausforderungen wie Zielschießen oder Rätsel-Level umfasst und so für zusätzlichen Spielspaß sorgt.</w:t>
+            </w:r>
+          </w:p>
+          <w:p>
+            <w:pPr>
+              <w:jc w:val="center"/>
+              <w:rPr>
+                <w:rFonts w:ascii="Arial" w:hAnsi="Arial" w:cs="Arial"/>
+                <w:lang w:val="de-AT"/>
+              </w:rPr>
+            </w:pPr>
+          </w:p>
+          <w:p>
+            <w:pPr>
+              <w:rPr>
+                <w:rFonts w:ascii="Arial" w:hAnsi="Arial" w:cs="Arial"/>
+                <w:lang w:val="de-AT"/>
+              </w:rPr>
+            </w:pPr>
+            <w:proofErr w:type="spellStart"/>
+            <w:r>
+              <w:rPr>
+                <w:rFonts w:ascii="Arial" w:hAnsi="Arial" w:cs="Arial"/>
+                <w:u w:val="single"/>
+                <w:lang w:val="de-AT"/>
+              </w:rPr>
+              <w:t>Lanzmaier</w:t>
+            </w:r>
+            <w:proofErr w:type="spellEnd"/>
+            <w:r>
+              <w:rPr>
+                <w:rFonts w:ascii="Arial" w:hAnsi="Arial" w:cs="Arial"/>
+                <w:u w:val="single"/>
+                <w:lang w:val="de-AT"/>
+              </w:rPr>
+              <w:t>:</w:t>
+            </w:r>
+            <w:r>
+              <w:rPr>
+                <w:rFonts w:ascii="Arial" w:hAnsi="Arial" w:cs="Arial"/>
+                <w:lang w:val="de-AT"/>
+              </w:rPr>
+              <w:t xml:space="preserve"> Am Ende der Arbeit soll ein stabiles und latenzarmes System zur Realisierung eines Mehrspieler-Modus in der Simulation bereitstehen. Dieses ermöglicht es bis zu vier realen Spielern gleichzeitig, den virtuellen Tisch zu steuern und in Teams gegeneinander anzutreten. Die zugrunde liegende Netzwerkarchitektur basiert entweder auf einem Peer-to-Peer- oder einem Client-Server-Modell und garantiert eine möglichst verzögerungsfreie Kommunikation. Darüber hinaus wird ein einheitliches, grafisch ansprechendes Asset-Design realisiert, das visuelle Konsistenz über die gesamte Simulation hinweg gewährleistet und reibungslos in der Darstellung sowie bei Animationen funktioniert.</w:t>
+            </w:r>
+          </w:p>
+          <w:p>
+            <w:pPr>
+              <w:rPr>
+                <w:rFonts w:ascii="Arial" w:hAnsi="Arial" w:cs="Arial"/>
+                <w:lang w:val="de-AT"/>
               </w:rPr>
             </w:pPr>
           </w:p>
         </w:tc>
       </w:tr>
     </w:tbl>
-    <w:p>
-      <w:pPr>
-        <w:rPr>
-          <w:rFonts w:ascii="Arial" w:hAnsi="Arial" w:cs="Arial"/>
-        </w:rPr>
-      </w:pPr>
-    </w:p>
     <w:p>
       <w:pPr>
         <w:pageBreakBefore/>
@@ -1060,20 +1170,80 @@
                 <w:rFonts w:ascii="Arial" w:hAnsi="Arial" w:cs="Arial"/>
               </w:rPr>
             </w:pPr>
-          </w:p>
-          <w:p>
-            <w:pPr>
-              <w:rPr>
-                <w:rFonts w:ascii="Arial" w:hAnsi="Arial" w:cs="Arial"/>
-              </w:rPr>
-            </w:pPr>
-          </w:p>
-          <w:p>
-            <w:pPr>
-              <w:rPr>
-                <w:rFonts w:ascii="Arial" w:hAnsi="Arial" w:cs="Arial"/>
-              </w:rPr>
-            </w:pPr>
+            <w:r>
+              <w:rPr>
+                <w:rFonts w:ascii="Arial" w:hAnsi="Arial" w:cs="Arial"/>
+                <w:noProof/>
+              </w:rPr>
+              <w:drawing>
+                <wp:inline distT="0" distB="0" distL="0" distR="0" wp14:anchorId="63D185B6" wp14:editId="78037D8B">
+                  <wp:extent cx="4000500" cy="2571750"/>
+                  <wp:effectExtent l="0" t="0" r="0" b="0"/>
+                  <wp:docPr id="2095046586" name="Grafik 1"/>
+                  <wp:cNvGraphicFramePr>
+                    <a:graphicFrameLocks xmlns:a="http://schemas.openxmlformats.org/drawingml/2006/main" noChangeAspect="1"/>
+                  </wp:cNvGraphicFramePr>
+                  <a:graphic xmlns:a="http://schemas.openxmlformats.org/drawingml/2006/main">
+                    <a:graphicData uri="http://schemas.openxmlformats.org/drawingml/2006/picture">
+                      <pic:pic xmlns:pic="http://schemas.openxmlformats.org/drawingml/2006/picture">
+                        <pic:nvPicPr>
+                          <pic:cNvPr id="0" name="Picture 1"/>
+                          <pic:cNvPicPr>
+                            <a:picLocks noChangeAspect="1" noChangeArrowheads="1"/>
+                          </pic:cNvPicPr>
+                        </pic:nvPicPr>
+                        <pic:blipFill>
+                          <a:blip r:embed="rId6">
+                            <a:extLst>
+                              <a:ext uri="{28A0092B-C50C-407E-A947-70E740481C1C}">
+                                <a14:useLocalDpi xmlns:a14="http://schemas.microsoft.com/office/drawing/2010/main" val="0"/>
+                              </a:ext>
+                            </a:extLst>
+                          </a:blip>
+                          <a:srcRect/>
+                          <a:stretch>
+                            <a:fillRect/>
+                          </a:stretch>
+                        </pic:blipFill>
+                        <pic:spPr bwMode="auto">
+                          <a:xfrm>
+                            <a:off x="0" y="0"/>
+                            <a:ext cx="4000500" cy="2571750"/>
+                          </a:xfrm>
+                          <a:prstGeom prst="rect">
+                            <a:avLst/>
+                          </a:prstGeom>
+                          <a:noFill/>
+                          <a:ln>
+                            <a:noFill/>
+                          </a:ln>
+                        </pic:spPr>
+                      </pic:pic>
+                    </a:graphicData>
+                  </a:graphic>
+                </wp:inline>
+              </w:drawing>
+            </w:r>
+          </w:p>
+          <w:p>
+            <w:pPr>
+              <w:rPr>
+                <w:rFonts w:ascii="Arial" w:hAnsi="Arial" w:cs="Arial"/>
+              </w:rPr>
+            </w:pPr>
+          </w:p>
+          <w:p>
+            <w:pPr>
+              <w:rPr>
+                <w:rFonts w:ascii="Arial" w:hAnsi="Arial" w:cs="Arial"/>
+              </w:rPr>
+            </w:pPr>
+            <w:r>
+              <w:rPr>
+                <w:rFonts w:ascii="Arial" w:hAnsi="Arial" w:cs="Arial"/>
+              </w:rPr>
+              <w:t>Grundlegender CAD-Prototyp des Controllers</w:t>
+            </w:r>
           </w:p>
           <w:p>
             <w:pPr>
@@ -1161,6 +1331,12 @@
                 <w:rFonts w:ascii="Arial" w:hAnsi="Arial" w:cs="Arial"/>
               </w:rPr>
             </w:pPr>
+            <w:r>
+              <w:rPr>
+                <w:rFonts w:ascii="Arial" w:hAnsi="Arial" w:cs="Arial"/>
+              </w:rPr>
+              <w:t>-----</w:t>
+            </w:r>
           </w:p>
         </w:tc>
       </w:tr>
@@ -1438,42 +1614,6 @@
         </w:tc>
       </w:tr>
     </w:tbl>
-    <w:p>
-      <w:pPr>
-        <w:rPr>
-          <w:rFonts w:ascii="Arial" w:hAnsi="Arial" w:cs="Arial"/>
-          <w:sz w:val="16"/>
-          <w:szCs w:val="16"/>
-        </w:rPr>
-      </w:pPr>
-    </w:p>
-    <w:p>
-      <w:pPr>
-        <w:rPr>
-          <w:rFonts w:ascii="Arial" w:hAnsi="Arial" w:cs="Arial"/>
-          <w:sz w:val="16"/>
-          <w:szCs w:val="16"/>
-        </w:rPr>
-      </w:pPr>
-    </w:p>
-    <w:p>
-      <w:pPr>
-        <w:rPr>
-          <w:rFonts w:ascii="Arial" w:hAnsi="Arial" w:cs="Arial"/>
-          <w:sz w:val="16"/>
-          <w:szCs w:val="16"/>
-        </w:rPr>
-      </w:pPr>
-    </w:p>
-    <w:p>
-      <w:pPr>
-        <w:rPr>
-          <w:rFonts w:ascii="Arial" w:hAnsi="Arial" w:cs="Arial"/>
-          <w:sz w:val="16"/>
-          <w:szCs w:val="16"/>
-        </w:rPr>
-      </w:pPr>
-    </w:p>
     <w:p>
       <w:pPr>
         <w:rPr>
@@ -1650,6 +1790,14 @@
                 <w:lang w:val="de-AT"/>
               </w:rPr>
             </w:pPr>
+            <w:r>
+              <w:rPr>
+                <w:rFonts w:ascii="Arial" w:hAnsi="Arial"/>
+                <w:sz w:val="22"/>
+                <w:lang w:val="de-AT"/>
+              </w:rPr>
+              <w:t>André Rath, 5AHWIN</w:t>
+            </w:r>
           </w:p>
         </w:tc>
         <w:tc>
@@ -1671,6 +1819,77 @@
                 <w:lang w:val="de-AT"/>
               </w:rPr>
             </w:pPr>
+          </w:p>
+          <w:p>
+            <w:pPr>
+              <w:pStyle w:val="Kopfzeile"/>
+              <w:ind w:right="-261"/>
+              <w:jc w:val="both"/>
+              <w:rPr>
+                <w:rFonts w:ascii="Arial" w:hAnsi="Arial"/>
+                <w:sz w:val="22"/>
+                <w:lang w:val="de-AT"/>
+              </w:rPr>
+            </w:pPr>
+            <w:r>
+              <w:rPr>
+                <w:rFonts w:ascii="Arial" w:hAnsi="Arial"/>
+                <w:sz w:val="22"/>
+                <w:lang w:val="de-AT"/>
+              </w:rPr>
+              <w:t xml:space="preserve">    </w:t>
+            </w:r>
+            <w:r>
+              <w:rPr>
+                <w:rFonts w:ascii="Arial" w:hAnsi="Arial"/>
+                <w:sz w:val="22"/>
+                <w:lang w:val="de-AT"/>
+              </w:rPr>
+              <w:drawing>
+                <wp:inline distT="0" distB="0" distL="0" distR="0" wp14:anchorId="59BF124A" wp14:editId="057D4778">
+                  <wp:extent cx="2238375" cy="457200"/>
+                  <wp:effectExtent l="0" t="0" r="9525" b="0"/>
+                  <wp:docPr id="509240805" name="Grafik 1"/>
+                  <wp:cNvGraphicFramePr>
+                    <a:graphicFrameLocks xmlns:a="http://schemas.openxmlformats.org/drawingml/2006/main" noChangeAspect="1"/>
+                  </wp:cNvGraphicFramePr>
+                  <a:graphic xmlns:a="http://schemas.openxmlformats.org/drawingml/2006/main">
+                    <a:graphicData uri="http://schemas.openxmlformats.org/drawingml/2006/picture">
+                      <pic:pic xmlns:pic="http://schemas.openxmlformats.org/drawingml/2006/picture">
+                        <pic:nvPicPr>
+                          <pic:cNvPr id="509240805" name=""/>
+                          <pic:cNvPicPr/>
+                        </pic:nvPicPr>
+                        <pic:blipFill rotWithShape="1">
+                          <a:blip r:embed="rId7"/>
+                          <a:srcRect r="18056" b="7573"/>
+                          <a:stretch>
+                            <a:fillRect/>
+                          </a:stretch>
+                        </pic:blipFill>
+                        <pic:spPr bwMode="auto">
+                          <a:xfrm>
+                            <a:off x="0" y="0"/>
+                            <a:ext cx="2275046" cy="464690"/>
+                          </a:xfrm>
+                          <a:prstGeom prst="rect">
+                            <a:avLst/>
+                          </a:prstGeom>
+                          <a:ln>
+                            <a:noFill/>
+                          </a:ln>
+                          <a:extLst>
+                            <a:ext uri="{53640926-AAD7-44D8-BBD7-CCE9431645EC}">
+                              <a14:shadowObscured xmlns:a14="http://schemas.microsoft.com/office/drawing/2010/main"/>
+                            </a:ext>
+                          </a:extLst>
+                        </pic:spPr>
+                      </pic:pic>
+                    </a:graphicData>
+                  </a:graphic>
+                </wp:inline>
+              </w:drawing>
+            </w:r>
           </w:p>
         </w:tc>
       </w:tr>
@@ -1695,6 +1914,14 @@
                 <w:lang w:val="de-AT"/>
               </w:rPr>
             </w:pPr>
+            <w:r>
+              <w:rPr>
+                <w:rFonts w:ascii="Arial" w:hAnsi="Arial"/>
+                <w:sz w:val="22"/>
+                <w:lang w:val="de-AT"/>
+              </w:rPr>
+              <w:t>Nikita Schaar, 5AHWIN</w:t>
+            </w:r>
           </w:p>
         </w:tc>
         <w:tc>
@@ -1713,6 +1940,48 @@
                 <w:lang w:val="de-AT"/>
               </w:rPr>
             </w:pPr>
+            <w:r>
+              <w:rPr>
+                <w:rFonts w:ascii="Arial" w:hAnsi="Arial"/>
+                <w:sz w:val="22"/>
+                <w:lang w:val="de-AT"/>
+              </w:rPr>
+              <w:drawing>
+                <wp:inline distT="0" distB="0" distL="0" distR="0" wp14:anchorId="223602B2" wp14:editId="0C94391A">
+                  <wp:extent cx="2286000" cy="465392"/>
+                  <wp:effectExtent l="0" t="0" r="0" b="0"/>
+                  <wp:docPr id="836448110" name="Grafik 1"/>
+                  <wp:cNvGraphicFramePr>
+                    <a:graphicFrameLocks xmlns:a="http://schemas.openxmlformats.org/drawingml/2006/main" noChangeAspect="1"/>
+                  </wp:cNvGraphicFramePr>
+                  <a:graphic xmlns:a="http://schemas.openxmlformats.org/drawingml/2006/main">
+                    <a:graphicData uri="http://schemas.openxmlformats.org/drawingml/2006/picture">
+                      <pic:pic xmlns:pic="http://schemas.openxmlformats.org/drawingml/2006/picture">
+                        <pic:nvPicPr>
+                          <pic:cNvPr id="836448110" name=""/>
+                          <pic:cNvPicPr/>
+                        </pic:nvPicPr>
+                        <pic:blipFill>
+                          <a:blip r:embed="rId8"/>
+                          <a:stretch>
+                            <a:fillRect/>
+                          </a:stretch>
+                        </pic:blipFill>
+                        <pic:spPr>
+                          <a:xfrm>
+                            <a:off x="0" y="0"/>
+                            <a:ext cx="2313762" cy="471044"/>
+                          </a:xfrm>
+                          <a:prstGeom prst="rect">
+                            <a:avLst/>
+                          </a:prstGeom>
+                        </pic:spPr>
+                      </pic:pic>
+                    </a:graphicData>
+                  </a:graphic>
+                </wp:inline>
+              </w:drawing>
+            </w:r>
           </w:p>
         </w:tc>
       </w:tr>
@@ -1737,6 +2006,32 @@
                 <w:lang w:val="de-AT"/>
               </w:rPr>
             </w:pPr>
+            <w:r>
+              <w:rPr>
+                <w:rFonts w:ascii="Arial" w:hAnsi="Arial"/>
+                <w:sz w:val="22"/>
+                <w:lang w:val="de-AT"/>
+              </w:rPr>
+              <w:t xml:space="preserve">Luan </w:t>
+            </w:r>
+            <w:proofErr w:type="spellStart"/>
+            <w:r>
+              <w:rPr>
+                <w:rFonts w:ascii="Arial" w:hAnsi="Arial"/>
+                <w:sz w:val="22"/>
+                <w:lang w:val="de-AT"/>
+              </w:rPr>
+              <w:t>Lanzmaier</w:t>
+            </w:r>
+            <w:proofErr w:type="spellEnd"/>
+            <w:r>
+              <w:rPr>
+                <w:rFonts w:ascii="Arial" w:hAnsi="Arial"/>
+                <w:sz w:val="22"/>
+                <w:lang w:val="de-AT"/>
+              </w:rPr>
+              <w:t>, 5BHWIN</w:t>
+            </w:r>
           </w:p>
         </w:tc>
         <w:tc>
@@ -1755,24 +2050,52 @@
                 <w:lang w:val="de-AT"/>
               </w:rPr>
             </w:pPr>
+            <w:r>
+              <w:rPr>
+                <w:rFonts w:ascii="Arial" w:hAnsi="Arial"/>
+                <w:sz w:val="22"/>
+                <w:lang w:val="de-AT"/>
+              </w:rPr>
+              <w:drawing>
+                <wp:inline distT="0" distB="0" distL="0" distR="0" wp14:anchorId="3FA09BA0" wp14:editId="21483B5C">
+                  <wp:extent cx="2619375" cy="695038"/>
+                  <wp:effectExtent l="0" t="0" r="0" b="0"/>
+                  <wp:docPr id="764264356" name="Grafik 1"/>
+                  <wp:cNvGraphicFramePr>
+                    <a:graphicFrameLocks xmlns:a="http://schemas.openxmlformats.org/drawingml/2006/main" noChangeAspect="1"/>
+                  </wp:cNvGraphicFramePr>
+                  <a:graphic xmlns:a="http://schemas.openxmlformats.org/drawingml/2006/main">
+                    <a:graphicData uri="http://schemas.openxmlformats.org/drawingml/2006/picture">
+                      <pic:pic xmlns:pic="http://schemas.openxmlformats.org/drawingml/2006/picture">
+                        <pic:nvPicPr>
+                          <pic:cNvPr id="764264356" name=""/>
+                          <pic:cNvPicPr/>
+                        </pic:nvPicPr>
+                        <pic:blipFill>
+                          <a:blip r:embed="rId9"/>
+                          <a:stretch>
+                            <a:fillRect/>
+                          </a:stretch>
+                        </pic:blipFill>
+                        <pic:spPr>
+                          <a:xfrm>
+                            <a:off x="0" y="0"/>
+                            <a:ext cx="2635852" cy="699410"/>
+                          </a:xfrm>
+                          <a:prstGeom prst="rect">
+                            <a:avLst/>
+                          </a:prstGeom>
+                        </pic:spPr>
+                      </pic:pic>
+                    </a:graphicData>
+                  </a:graphic>
+                </wp:inline>
+              </w:drawing>
+            </w:r>
           </w:p>
         </w:tc>
       </w:tr>
     </w:tbl>
-    <w:p>
-      <w:pPr>
-        <w:pStyle w:val="Untertitel"/>
-        <w:ind w:firstLine="0"/>
-        <w:jc w:val="left"/>
-        <w:rPr>
-          <w:rFonts w:ascii="Arial" w:hAnsi="Arial" w:cs="Arial"/>
-          <w:b w:val="0"/>
-          <w:bCs/>
-          <w:sz w:val="24"/>
-          <w:lang w:val="de-AT"/>
-        </w:rPr>
-      </w:pPr>
-    </w:p>
     <w:p>
       <w:pPr>
         <w:rPr>
@@ -1783,8 +2106,8 @@
       </w:pPr>
     </w:p>
     <w:sectPr>
-      <w:headerReference w:type="default" r:id="rId6"/>
-      <w:footerReference w:type="default" r:id="rId7"/>
+      <w:headerReference w:type="default" r:id="rId10"/>
+      <w:footerReference w:type="default" r:id="rId11"/>
       <w:pgSz w:w="11906" w:h="16838"/>
       <w:pgMar w:top="1134" w:right="1134" w:bottom="1134" w:left="1134" w:header="709" w:footer="709" w:gutter="0"/>
       <w:cols w:space="708"/>
@@ -1795,7 +2118,7 @@
 </file>
 
 <file path=word/endnotes.xml><?xml version="1.0" encoding="utf-8"?>
-<w:endnotes xmlns:wpc="http://schemas.microsoft.com/office/word/2010/wordprocessingCanvas" xmlns:cx="http://schemas.microsoft.com/office/drawing/2014/chartex" xmlns:cx1="http://schemas.microsoft.com/office/drawing/2015/9/8/chartex" xmlns:cx2="http://schemas.microsoft.com/office/drawing/2015/10/21/chartex" xmlns:cx3="http://schemas.microsoft.com/office/drawing/2016/5/9/chartex" xmlns:cx4="http://schemas.microsoft.com/office/drawing/2016/5/10/chartex" xmlns:cx5="http://schemas.microsoft.com/office/drawing/2016/5/11/chartex" xmlns:cx6="http://schemas.microsoft.com/office/drawing/2016/5/12/chartex" xmlns:cx7="http://schemas.microsoft.com/office/drawing/2016/5/13/chartex" xmlns:cx8="http://schemas.microsoft.com/office/drawing/2016/5/14/chartex" xmlns:mc="http://schemas.openxmlformats.org/markup-compatibility/2006" xmlns:aink="http://schemas.microsoft.com/office/drawing/2016/ink" xmlns:am3d="http://schemas.microsoft.com/office/drawing/2017/model3d" xmlns:o="urn:schemas-microsoft-com:office:office" xmlns:r="http://schemas.openxmlformats.org/officeDocument/2006/relationships" xmlns:m="http://schemas.openxmlformats.org/officeDocument/2006/math" xmlns:v="urn:schemas-microsoft-com:vml" xmlns:wp14="http://schemas.microsoft.com/office/word/2010/wordprocessingDrawing" xmlns:wp="http://schemas.openxmlformats.org/drawingml/2006/wordprocessingDrawing" xmlns:w10="urn:schemas-microsoft-com:office:word" xmlns:w="http://schemas.openxmlformats.org/wordprocessingml/2006/main" xmlns:w14="http://schemas.microsoft.com/office/word/2010/wordml" xmlns:w15="http://schemas.microsoft.com/office/word/2012/wordml" xmlns:w16cid="http://schemas.microsoft.com/office/word/2016/wordml/cid" xmlns:w16se="http://schemas.microsoft.com/office/word/2015/wordml/symex" xmlns:wpg="http://schemas.microsoft.com/office/word/2010/wordprocessingGroup" xmlns:wpi="http://schemas.microsoft.com/office/word/2010/wordprocessingInk" xmlns:wne="http://schemas.microsoft.com/office/word/2006/wordml" xmlns:wps="http://schemas.microsoft.com/office/word/2010/wordprocessingShape" mc:Ignorable="w14 w15 w16se w16cid wp14">
+<w:endnotes xmlns:wpc="http://schemas.microsoft.com/office/word/2010/wordprocessingCanvas" xmlns:cx="http://schemas.microsoft.com/office/drawing/2014/chartex" xmlns:cx1="http://schemas.microsoft.com/office/drawing/2015/9/8/chartex" xmlns:cx2="http://schemas.microsoft.com/office/drawing/2015/10/21/chartex" xmlns:cx3="http://schemas.microsoft.com/office/drawing/2016/5/9/chartex" xmlns:cx4="http://schemas.microsoft.com/office/drawing/2016/5/10/chartex" xmlns:cx5="http://schemas.microsoft.com/office/drawing/2016/5/11/chartex" xmlns:cx6="http://schemas.microsoft.com/office/drawing/2016/5/12/chartex" xmlns:cx7="http://schemas.microsoft.com/office/drawing/2016/5/13/chartex" xmlns:cx8="http://schemas.microsoft.com/office/drawing/2016/5/14/chartex" xmlns:mc="http://schemas.openxmlformats.org/markup-compatibility/2006" xmlns:aink="http://schemas.microsoft.com/office/drawing/2016/ink" xmlns:am3d="http://schemas.microsoft.com/office/drawing/2017/model3d" xmlns:o="urn:schemas-microsoft-com:office:office" xmlns:oel="http://schemas.microsoft.com/office/2019/extlst" xmlns:r="http://schemas.openxmlformats.org/officeDocument/2006/relationships" xmlns:m="http://schemas.openxmlformats.org/officeDocument/2006/math" xmlns:v="urn:schemas-microsoft-com:vml" xmlns:wp14="http://schemas.microsoft.com/office/word/2010/wordprocessingDrawing" xmlns:wp="http://schemas.openxmlformats.org/drawingml/2006/wordprocessingDrawing" xmlns:w10="urn:schemas-microsoft-com:office:word" xmlns:w="http://schemas.openxmlformats.org/wordprocessingml/2006/main" xmlns:w14="http://schemas.microsoft.com/office/word/2010/wordml" xmlns:w15="http://schemas.microsoft.com/office/word/2012/wordml" xmlns:w16cex="http://schemas.microsoft.com/office/word/2018/wordml/cex" xmlns:w16cid="http://schemas.microsoft.com/office/word/2016/wordml/cid" xmlns:w16="http://schemas.microsoft.com/office/word/2018/wordml" xmlns:w16du="http://schemas.microsoft.com/office/word/2023/wordml/word16du" xmlns:w16sdtdh="http://schemas.microsoft.com/office/word/2020/wordml/sdtdatahash" xmlns:w16sdtfl="http://schemas.microsoft.com/office/word/2024/wordml/sdtformatlock" xmlns:w16se="http://schemas.microsoft.com/office/word/2015/wordml/symex" xmlns:wpg="http://schemas.microsoft.com/office/word/2010/wordprocessingGroup" xmlns:wpi="http://schemas.microsoft.com/office/word/2010/wordprocessingInk" xmlns:wne="http://schemas.microsoft.com/office/word/2006/wordml" xmlns:wps="http://schemas.microsoft.com/office/word/2010/wordprocessingShape" mc:Ignorable="w14 w15 w16se w16cid w16 w16cex w16sdtdh w16sdtfl w16du wp14">
   <w:endnote w:type="separator" w:id="-1">
     <w:p>
       <w:r>
@@ -1814,7 +2137,7 @@
 </file>
 
 <file path=word/footer1.xml><?xml version="1.0" encoding="utf-8"?>
-<w:ftr xmlns:wpc="http://schemas.microsoft.com/office/word/2010/wordprocessingCanvas" xmlns:cx="http://schemas.microsoft.com/office/drawing/2014/chartex" xmlns:cx1="http://schemas.microsoft.com/office/drawing/2015/9/8/chartex" xmlns:cx2="http://schemas.microsoft.com/office/drawing/2015/10/21/chartex" xmlns:cx3="http://schemas.microsoft.com/office/drawing/2016/5/9/chartex" xmlns:cx4="http://schemas.microsoft.com/office/drawing/2016/5/10/chartex" xmlns:cx5="http://schemas.microsoft.com/office/drawing/2016/5/11/chartex" xmlns:cx6="http://schemas.microsoft.com/office/drawing/2016/5/12/chartex" xmlns:cx7="http://schemas.microsoft.com/office/drawing/2016/5/13/chartex" xmlns:cx8="http://schemas.microsoft.com/office/drawing/2016/5/14/chartex" xmlns:mc="http://schemas.openxmlformats.org/markup-compatibility/2006" xmlns:aink="http://schemas.microsoft.com/office/drawing/2016/ink" xmlns:am3d="http://schemas.microsoft.com/office/drawing/2017/model3d" xmlns:o="urn:schemas-microsoft-com:office:office" xmlns:r="http://schemas.openxmlformats.org/officeDocument/2006/relationships" xmlns:m="http://schemas.openxmlformats.org/officeDocument/2006/math" xmlns:v="urn:schemas-microsoft-com:vml" xmlns:wp14="http://schemas.microsoft.com/office/word/2010/wordprocessingDrawing" xmlns:wp="http://schemas.openxmlformats.org/drawingml/2006/wordprocessingDrawing" xmlns:w10="urn:schemas-microsoft-com:office:word" xmlns:w="http://schemas.openxmlformats.org/wordprocessingml/2006/main" xmlns:w14="http://schemas.microsoft.com/office/word/2010/wordml" xmlns:w15="http://schemas.microsoft.com/office/word/2012/wordml" xmlns:w16cid="http://schemas.microsoft.com/office/word/2016/wordml/cid" xmlns:w16se="http://schemas.microsoft.com/office/word/2015/wordml/symex" xmlns:wpg="http://schemas.microsoft.com/office/word/2010/wordprocessingGroup" xmlns:wpi="http://schemas.microsoft.com/office/word/2010/wordprocessingInk" xmlns:wne="http://schemas.microsoft.com/office/word/2006/wordml" xmlns:wps="http://schemas.microsoft.com/office/word/2010/wordprocessingShape" mc:Ignorable="w14 w15 w16se w16cid wp14">
+<w:ftr xmlns:wpc="http://schemas.microsoft.com/office/word/2010/wordprocessingCanvas" xmlns:cx="http://schemas.microsoft.com/office/drawing/2014/chartex" xmlns:cx1="http://schemas.microsoft.com/office/drawing/2015/9/8/chartex" xmlns:cx2="http://schemas.microsoft.com/office/drawing/2015/10/21/chartex" xmlns:cx3="http://schemas.microsoft.com/office/drawing/2016/5/9/chartex" xmlns:cx4="http://schemas.microsoft.com/office/drawing/2016/5/10/chartex" xmlns:cx5="http://schemas.microsoft.com/office/drawing/2016/5/11/chartex" xmlns:cx6="http://schemas.microsoft.com/office/drawing/2016/5/12/chartex" xmlns:cx7="http://schemas.microsoft.com/office/drawing/2016/5/13/chartex" xmlns:cx8="http://schemas.microsoft.com/office/drawing/2016/5/14/chartex" xmlns:mc="http://schemas.openxmlformats.org/markup-compatibility/2006" xmlns:aink="http://schemas.microsoft.com/office/drawing/2016/ink" xmlns:am3d="http://schemas.microsoft.com/office/drawing/2017/model3d" xmlns:o="urn:schemas-microsoft-com:office:office" xmlns:oel="http://schemas.microsoft.com/office/2019/extlst" xmlns:r="http://schemas.openxmlformats.org/officeDocument/2006/relationships" xmlns:m="http://schemas.openxmlformats.org/officeDocument/2006/math" xmlns:v="urn:schemas-microsoft-com:vml" xmlns:wp14="http://schemas.microsoft.com/office/word/2010/wordprocessingDrawing" xmlns:wp="http://schemas.openxmlformats.org/drawingml/2006/wordprocessingDrawing" xmlns:w10="urn:schemas-microsoft-com:office:word" xmlns:w="http://schemas.openxmlformats.org/wordprocessingml/2006/main" xmlns:w14="http://schemas.microsoft.com/office/word/2010/wordml" xmlns:w15="http://schemas.microsoft.com/office/word/2012/wordml" xmlns:w16cex="http://schemas.microsoft.com/office/word/2018/wordml/cex" xmlns:w16cid="http://schemas.microsoft.com/office/word/2016/wordml/cid" xmlns:w16="http://schemas.microsoft.com/office/word/2018/wordml" xmlns:w16du="http://schemas.microsoft.com/office/word/2023/wordml/word16du" xmlns:w16sdtdh="http://schemas.microsoft.com/office/word/2020/wordml/sdtdatahash" xmlns:w16sdtfl="http://schemas.microsoft.com/office/word/2024/wordml/sdtformatlock" xmlns:w16se="http://schemas.microsoft.com/office/word/2015/wordml/symex" xmlns:wpg="http://schemas.microsoft.com/office/word/2010/wordprocessingGroup" xmlns:wpi="http://schemas.microsoft.com/office/word/2010/wordprocessingInk" xmlns:wne="http://schemas.microsoft.com/office/word/2006/wordml" xmlns:wps="http://schemas.microsoft.com/office/word/2010/wordprocessingShape" mc:Ignorable="w14 w15 w16se w16cid w16 w16cex w16sdtdh w16sdtfl w16du wp14">
   <w:p>
     <w:pPr>
       <w:pStyle w:val="Fuzeile"/>
@@ -2066,7 +2389,7 @@
 </file>
 
 <file path=word/footnotes.xml><?xml version="1.0" encoding="utf-8"?>
-<w:footnotes xmlns:wpc="http://schemas.microsoft.com/office/word/2010/wordprocessingCanvas" xmlns:cx="http://schemas.microsoft.com/office/drawing/2014/chartex" xmlns:cx1="http://schemas.microsoft.com/office/drawing/2015/9/8/chartex" xmlns:cx2="http://schemas.microsoft.com/office/drawing/2015/10/21/chartex" xmlns:cx3="http://schemas.microsoft.com/office/drawing/2016/5/9/chartex" xmlns:cx4="http://schemas.microsoft.com/office/drawing/2016/5/10/chartex" xmlns:cx5="http://schemas.microsoft.com/office/drawing/2016/5/11/chartex" xmlns:cx6="http://schemas.microsoft.com/office/drawing/2016/5/12/chartex" xmlns:cx7="http://schemas.microsoft.com/office/drawing/2016/5/13/chartex" xmlns:cx8="http://schemas.microsoft.com/office/drawing/2016/5/14/chartex" xmlns:mc="http://schemas.openxmlformats.org/markup-compatibility/2006" xmlns:aink="http://schemas.microsoft.com/office/drawing/2016/ink" xmlns:am3d="http://schemas.microsoft.com/office/drawing/2017/model3d" xmlns:o="urn:schemas-microsoft-com:office:office" xmlns:r="http://schemas.openxmlformats.org/officeDocument/2006/relationships" xmlns:m="http://schemas.openxmlformats.org/officeDocument/2006/math" xmlns:v="urn:schemas-microsoft-com:vml" xmlns:wp14="http://schemas.microsoft.com/office/word/2010/wordprocessingDrawing" xmlns:wp="http://schemas.openxmlformats.org/drawingml/2006/wordprocessingDrawing" xmlns:w10="urn:schemas-microsoft-com:office:word" xmlns:w="http://schemas.openxmlformats.org/wordprocessingml/2006/main" xmlns:w14="http://schemas.microsoft.com/office/word/2010/wordml" xmlns:w15="http://schemas.microsoft.com/office/word/2012/wordml" xmlns:w16cid="http://schemas.microsoft.com/office/word/2016/wordml/cid" xmlns:w16se="http://schemas.microsoft.com/office/word/2015/wordml/symex" xmlns:wpg="http://schemas.microsoft.com/office/word/2010/wordprocessingGroup" xmlns:wpi="http://schemas.microsoft.com/office/word/2010/wordprocessingInk" xmlns:wne="http://schemas.microsoft.com/office/word/2006/wordml" xmlns:wps="http://schemas.microsoft.com/office/word/2010/wordprocessingShape" mc:Ignorable="w14 w15 w16se w16cid wp14">
+<w:footnotes xmlns:wpc="http://schemas.microsoft.com/office/word/2010/wordprocessingCanvas" xmlns:cx="http://schemas.microsoft.com/office/drawing/2014/chartex" xmlns:cx1="http://schemas.microsoft.com/office/drawing/2015/9/8/chartex" xmlns:cx2="http://schemas.microsoft.com/office/drawing/2015/10/21/chartex" xmlns:cx3="http://schemas.microsoft.com/office/drawing/2016/5/9/chartex" xmlns:cx4="http://schemas.microsoft.com/office/drawing/2016/5/10/chartex" xmlns:cx5="http://schemas.microsoft.com/office/drawing/2016/5/11/chartex" xmlns:cx6="http://schemas.microsoft.com/office/drawing/2016/5/12/chartex" xmlns:cx7="http://schemas.microsoft.com/office/drawing/2016/5/13/chartex" xmlns:cx8="http://schemas.microsoft.com/office/drawing/2016/5/14/chartex" xmlns:mc="http://schemas.openxmlformats.org/markup-compatibility/2006" xmlns:aink="http://schemas.microsoft.com/office/drawing/2016/ink" xmlns:am3d="http://schemas.microsoft.com/office/drawing/2017/model3d" xmlns:o="urn:schemas-microsoft-com:office:office" xmlns:oel="http://schemas.microsoft.com/office/2019/extlst" xmlns:r="http://schemas.openxmlformats.org/officeDocument/2006/relationships" xmlns:m="http://schemas.openxmlformats.org/officeDocument/2006/math" xmlns:v="urn:schemas-microsoft-com:vml" xmlns:wp14="http://schemas.microsoft.com/office/word/2010/wordprocessingDrawing" xmlns:wp="http://schemas.openxmlformats.org/drawingml/2006/wordprocessingDrawing" xmlns:w10="urn:schemas-microsoft-com:office:word" xmlns:w="http://schemas.openxmlformats.org/wordprocessingml/2006/main" xmlns:w14="http://schemas.microsoft.com/office/word/2010/wordml" xmlns:w15="http://schemas.microsoft.com/office/word/2012/wordml" xmlns:w16cex="http://schemas.microsoft.com/office/word/2018/wordml/cex" xmlns:w16cid="http://schemas.microsoft.com/office/word/2016/wordml/cid" xmlns:w16="http://schemas.microsoft.com/office/word/2018/wordml" xmlns:w16du="http://schemas.microsoft.com/office/word/2023/wordml/word16du" xmlns:w16sdtdh="http://schemas.microsoft.com/office/word/2020/wordml/sdtdatahash" xmlns:w16sdtfl="http://schemas.microsoft.com/office/word/2024/wordml/sdtformatlock" xmlns:w16se="http://schemas.microsoft.com/office/word/2015/wordml/symex" xmlns:wpg="http://schemas.microsoft.com/office/word/2010/wordprocessingGroup" xmlns:wpi="http://schemas.microsoft.com/office/word/2010/wordprocessingInk" xmlns:wne="http://schemas.microsoft.com/office/word/2006/wordml" xmlns:wps="http://schemas.microsoft.com/office/word/2010/wordprocessingShape" mc:Ignorable="w14 w15 w16se w16cid w16 w16cex w16sdtdh w16sdtfl w16du wp14">
   <w:footnote w:type="separator" w:id="-1">
     <w:p>
       <w:r>
@@ -2085,7 +2408,7 @@
 </file>
 
 <file path=word/header1.xml><?xml version="1.0" encoding="utf-8"?>
-<w:hdr xmlns:wpc="http://schemas.microsoft.com/office/word/2010/wordprocessingCanvas" xmlns:cx="http://schemas.microsoft.com/office/drawing/2014/chartex" xmlns:cx1="http://schemas.microsoft.com/office/drawing/2015/9/8/chartex" xmlns:cx2="http://schemas.microsoft.com/office/drawing/2015/10/21/chartex" xmlns:cx3="http://schemas.microsoft.com/office/drawing/2016/5/9/chartex" xmlns:cx4="http://schemas.microsoft.com/office/drawing/2016/5/10/chartex" xmlns:cx5="http://schemas.microsoft.com/office/drawing/2016/5/11/chartex" xmlns:cx6="http://schemas.microsoft.com/office/drawing/2016/5/12/chartex" xmlns:cx7="http://schemas.microsoft.com/office/drawing/2016/5/13/chartex" xmlns:cx8="http://schemas.microsoft.com/office/drawing/2016/5/14/chartex" xmlns:mc="http://schemas.openxmlformats.org/markup-compatibility/2006" xmlns:aink="http://schemas.microsoft.com/office/drawing/2016/ink" xmlns:am3d="http://schemas.microsoft.com/office/drawing/2017/model3d" xmlns:o="urn:schemas-microsoft-com:office:office" xmlns:r="http://schemas.openxmlformats.org/officeDocument/2006/relationships" xmlns:m="http://schemas.openxmlformats.org/officeDocument/2006/math" xmlns:v="urn:schemas-microsoft-com:vml" xmlns:wp14="http://schemas.microsoft.com/office/word/2010/wordprocessingDrawing" xmlns:wp="http://schemas.openxmlformats.org/drawingml/2006/wordprocessingDrawing" xmlns:w10="urn:schemas-microsoft-com:office:word" xmlns:w="http://schemas.openxmlformats.org/wordprocessingml/2006/main" xmlns:w14="http://schemas.microsoft.com/office/word/2010/wordml" xmlns:w15="http://schemas.microsoft.com/office/word/2012/wordml" xmlns:w16cid="http://schemas.microsoft.com/office/word/2016/wordml/cid" xmlns:w16se="http://schemas.microsoft.com/office/word/2015/wordml/symex" xmlns:wpg="http://schemas.microsoft.com/office/word/2010/wordprocessingGroup" xmlns:wpi="http://schemas.microsoft.com/office/word/2010/wordprocessingInk" xmlns:wne="http://schemas.microsoft.com/office/word/2006/wordml" xmlns:wps="http://schemas.microsoft.com/office/word/2010/wordprocessingShape" mc:Ignorable="w14 w15 w16se w16cid wp14">
+<w:hdr xmlns:wpc="http://schemas.microsoft.com/office/word/2010/wordprocessingCanvas" xmlns:cx="http://schemas.microsoft.com/office/drawing/2014/chartex" xmlns:cx1="http://schemas.microsoft.com/office/drawing/2015/9/8/chartex" xmlns:cx2="http://schemas.microsoft.com/office/drawing/2015/10/21/chartex" xmlns:cx3="http://schemas.microsoft.com/office/drawing/2016/5/9/chartex" xmlns:cx4="http://schemas.microsoft.com/office/drawing/2016/5/10/chartex" xmlns:cx5="http://schemas.microsoft.com/office/drawing/2016/5/11/chartex" xmlns:cx6="http://schemas.microsoft.com/office/drawing/2016/5/12/chartex" xmlns:cx7="http://schemas.microsoft.com/office/drawing/2016/5/13/chartex" xmlns:cx8="http://schemas.microsoft.com/office/drawing/2016/5/14/chartex" xmlns:mc="http://schemas.openxmlformats.org/markup-compatibility/2006" xmlns:aink="http://schemas.microsoft.com/office/drawing/2016/ink" xmlns:am3d="http://schemas.microsoft.com/office/drawing/2017/model3d" xmlns:o="urn:schemas-microsoft-com:office:office" xmlns:oel="http://schemas.microsoft.com/office/2019/extlst" xmlns:r="http://schemas.openxmlformats.org/officeDocument/2006/relationships" xmlns:m="http://schemas.openxmlformats.org/officeDocument/2006/math" xmlns:v="urn:schemas-microsoft-com:vml" xmlns:wp14="http://schemas.microsoft.com/office/word/2010/wordprocessingDrawing" xmlns:wp="http://schemas.openxmlformats.org/drawingml/2006/wordprocessingDrawing" xmlns:w10="urn:schemas-microsoft-com:office:word" xmlns:w="http://schemas.openxmlformats.org/wordprocessingml/2006/main" xmlns:w14="http://schemas.microsoft.com/office/word/2010/wordml" xmlns:w15="http://schemas.microsoft.com/office/word/2012/wordml" xmlns:w16cex="http://schemas.microsoft.com/office/word/2018/wordml/cex" xmlns:w16cid="http://schemas.microsoft.com/office/word/2016/wordml/cid" xmlns:w16="http://schemas.microsoft.com/office/word/2018/wordml" xmlns:w16du="http://schemas.microsoft.com/office/word/2023/wordml/word16du" xmlns:w16sdtdh="http://schemas.microsoft.com/office/word/2020/wordml/sdtdatahash" xmlns:w16sdtfl="http://schemas.microsoft.com/office/word/2024/wordml/sdtformatlock" xmlns:w16se="http://schemas.microsoft.com/office/word/2015/wordml/symex" xmlns:wpg="http://schemas.microsoft.com/office/word/2010/wordprocessingGroup" xmlns:wpi="http://schemas.microsoft.com/office/word/2010/wordprocessingInk" xmlns:wne="http://schemas.microsoft.com/office/word/2006/wordml" xmlns:wps="http://schemas.microsoft.com/office/word/2010/wordprocessingShape" mc:Ignorable="w14 w15 w16se w16cid w16 w16cex w16sdtdh w16sdtfl w16du wp14">
   <w:tbl>
     <w:tblPr>
       <w:tblW w:w="4950" w:type="pct"/>
@@ -2141,7 +2464,7 @@
               <w:lang w:val="de-DE" w:eastAsia="de-DE"/>
             </w:rPr>
             <w:drawing>
-              <wp:inline distT="0" distB="0" distL="0" distR="0" wp14:anchorId="2E010449" wp14:editId="6FD08C4A">
+              <wp:inline distT="0" distB="0" distL="0" distR="0" wp14:anchorId="47AC50A0" wp14:editId="389DE996">
                 <wp:extent cx="1076325" cy="215900"/>
                 <wp:effectExtent l="0" t="0" r="9525" b="0"/>
                 <wp:docPr id="3" name="Grafik 1">
@@ -2194,7 +2517,6 @@
                         <a:ln>
                           <a:noFill/>
                         </a:ln>
-                        <a:extLst/>
                       </pic:spPr>
                     </pic:pic>
                   </a:graphicData>
@@ -2337,7 +2659,7 @@
 </file>
 
 <file path=word/styles.xml><?xml version="1.0" encoding="utf-8"?>
-<w:styles xmlns:mc="http://schemas.openxmlformats.org/markup-compatibility/2006" xmlns:r="http://schemas.openxmlformats.org/officeDocument/2006/relationships" xmlns:w="http://schemas.openxmlformats.org/wordprocessingml/2006/main" xmlns:w14="http://schemas.microsoft.com/office/word/2010/wordml" xmlns:w15="http://schemas.microsoft.com/office/word/2012/wordml" xmlns:w16cid="http://schemas.microsoft.com/office/word/2016/wordml/cid" xmlns:w16se="http://schemas.microsoft.com/office/word/2015/wordml/symex" mc:Ignorable="w14 w15 w16se w16cid">
+<w:styles xmlns:mc="http://schemas.openxmlformats.org/markup-compatibility/2006" xmlns:r="http://schemas.openxmlformats.org/officeDocument/2006/relationships" xmlns:w="http://schemas.openxmlformats.org/wordprocessingml/2006/main" xmlns:w14="http://schemas.microsoft.com/office/word/2010/wordml" xmlns:w15="http://schemas.microsoft.com/office/word/2012/wordml" xmlns:w16cex="http://schemas.microsoft.com/office/word/2018/wordml/cex" xmlns:w16cid="http://schemas.microsoft.com/office/word/2016/wordml/cid" xmlns:w16="http://schemas.microsoft.com/office/word/2018/wordml" xmlns:w16du="http://schemas.microsoft.com/office/word/2023/wordml/word16du" xmlns:w16sdtdh="http://schemas.microsoft.com/office/word/2020/wordml/sdtdatahash" xmlns:w16sdtfl="http://schemas.microsoft.com/office/word/2024/wordml/sdtformatlock" xmlns:w16se="http://schemas.microsoft.com/office/word/2015/wordml/symex" mc:Ignorable="w14 w15 w16se w16cid w16 w16cex w16sdtdh w16sdtfl w16du">
   <w:docDefaults>
     <w:rPrDefault>
       <w:rPr>
@@ -2347,7 +2669,7 @@
     </w:rPrDefault>
     <w:pPrDefault/>
   </w:docDefaults>
-  <w:latentStyles w:defLockedState="0" w:defUIPriority="99" w:defSemiHidden="0" w:defUnhideWhenUsed="0" w:defQFormat="0" w:count="375">
+  <w:latentStyles w:defLockedState="0" w:defUIPriority="99" w:defSemiHidden="0" w:defUnhideWhenUsed="0" w:defQFormat="0" w:count="376">
     <w:lsdException w:name="Normal" w:uiPriority="0" w:qFormat="1"/>
     <w:lsdException w:name="heading 1" w:uiPriority="9" w:qFormat="1"/>
     <w:lsdException w:name="heading 2" w:semiHidden="1" w:uiPriority="9" w:unhideWhenUsed="1" w:qFormat="1"/>
@@ -2453,6 +2775,7 @@
     <w:lsdException w:name="HTML Sample" w:semiHidden="1" w:unhideWhenUsed="1"/>
     <w:lsdException w:name="HTML Typewriter" w:semiHidden="1" w:unhideWhenUsed="1"/>
     <w:lsdException w:name="HTML Variable" w:semiHidden="1" w:unhideWhenUsed="1"/>
+    <w:lsdException w:name="Normal Table" w:semiHidden="1" w:unhideWhenUsed="1"/>
     <w:lsdException w:name="annotation subject" w:semiHidden="1" w:unhideWhenUsed="1"/>
     <w:lsdException w:name="No List" w:semiHidden="1" w:unhideWhenUsed="1"/>
     <w:lsdException w:name="Outline List 1" w:semiHidden="1" w:unhideWhenUsed="1"/>
@@ -2496,8 +2819,10 @@
     <w:lsdException w:name="Table Elegant" w:semiHidden="1" w:unhideWhenUsed="1"/>
     <w:lsdException w:name="Table Professional" w:semiHidden="1" w:unhideWhenUsed="1"/>
     <w:lsdException w:name="Table Subtle 1" w:semiHidden="1" w:unhideWhenUsed="1"/>
+    <w:lsdException w:name="Table Subtle 2" w:semiHidden="1" w:unhideWhenUsed="1"/>
     <w:lsdException w:name="Table Web 1" w:semiHidden="1" w:unhideWhenUsed="1"/>
     <w:lsdException w:name="Table Web 2" w:semiHidden="1" w:unhideWhenUsed="1"/>
+    <w:lsdException w:name="Table Web 3" w:semiHidden="1" w:unhideWhenUsed="1"/>
     <w:lsdException w:name="Balloon Text" w:semiHidden="1" w:unhideWhenUsed="1"/>
     <w:lsdException w:name="Table Grid" w:uiPriority="59"/>
     <w:lsdException w:name="Table Theme" w:semiHidden="1" w:unhideWhenUsed="1"/>
@@ -2720,6 +3045,7 @@
     <w:lsdException w:name="Smart Hyperlink" w:semiHidden="1" w:unhideWhenUsed="1"/>
     <w:lsdException w:name="Hashtag" w:semiHidden="1" w:unhideWhenUsed="1"/>
     <w:lsdException w:name="Unresolved Mention" w:semiHidden="1" w:unhideWhenUsed="1"/>
+    <w:lsdException w:name="Smart Link" w:semiHidden="1" w:unhideWhenUsed="1"/>
   </w:latentStyles>
   <w:style w:type="paragraph" w:default="1" w:styleId="Standard">
     <w:name w:val="Normal"/>
@@ -2799,7 +3125,6 @@
   <w:style w:type="character" w:default="1" w:styleId="Absatz-Standardschriftart">
     <w:name w:val="Default Paragraph Font"/>
     <w:uiPriority w:val="1"/>
-    <w:semiHidden/>
     <w:unhideWhenUsed/>
   </w:style>
   <w:style w:type="table" w:default="1" w:styleId="NormaleTabelle">

</xml_diff>

<commit_message>
Demi-Human Queen Marigga | Add a couple screenshots as well as a tiny amount of text
</commit_message>
<xml_diff>
--- a/Diplomarbeit/doc/HTL-DA-Doku-DE.docx
+++ b/Diplomarbeit/doc/HTL-DA-Doku-DE.docx
@@ -139,27 +139,7 @@
                 <w:szCs w:val="22"/>
                 <w:lang w:val="de-AT"/>
               </w:rPr>
-              <w:t xml:space="preserve">Luan </w:t>
-            </w:r>
-            <w:proofErr w:type="spellStart"/>
-            <w:r>
-              <w:rPr>
-                <w:rFonts w:ascii="Arial" w:hAnsi="Arial" w:cs="Arial"/>
-                <w:sz w:val="22"/>
-                <w:szCs w:val="22"/>
-                <w:lang w:val="de-AT"/>
-              </w:rPr>
-              <w:t>Lanzmaier</w:t>
-            </w:r>
-            <w:proofErr w:type="spellEnd"/>
-            <w:r>
-              <w:rPr>
-                <w:rFonts w:ascii="Arial" w:hAnsi="Arial" w:cs="Arial"/>
-                <w:sz w:val="22"/>
-                <w:szCs w:val="22"/>
-                <w:lang w:val="de-AT"/>
-              </w:rPr>
-              <w:t>, André Rath, Nikita Sch</w:t>
+              <w:t>Luan Lanzmaier, André Rath, Nikita Sch</w:t>
             </w:r>
             <w:r>
               <w:rPr>
@@ -344,34 +324,14 @@
                 <w:szCs w:val="22"/>
               </w:rPr>
             </w:pPr>
-            <w:proofErr w:type="spellStart"/>
-            <w:r>
-              <w:rPr>
-                <w:rFonts w:ascii="Arial" w:hAnsi="Arial" w:cs="Arial"/>
-                <w:sz w:val="22"/>
-                <w:szCs w:val="22"/>
-              </w:rPr>
-              <w:t>DigiKicker</w:t>
-            </w:r>
-            <w:proofErr w:type="spellEnd"/>
-            <w:r>
-              <w:rPr>
-                <w:rFonts w:ascii="Arial" w:hAnsi="Arial" w:cs="Arial"/>
-                <w:sz w:val="22"/>
-                <w:szCs w:val="22"/>
-              </w:rPr>
-              <w:t xml:space="preserve"> - Digitalisierung eines </w:t>
-            </w:r>
-            <w:proofErr w:type="spellStart"/>
-            <w:r>
-              <w:rPr>
-                <w:rFonts w:ascii="Arial" w:hAnsi="Arial" w:cs="Arial"/>
-                <w:sz w:val="22"/>
-                <w:szCs w:val="22"/>
-              </w:rPr>
-              <w:t>Tischfussballtisches</w:t>
-            </w:r>
-            <w:proofErr w:type="spellEnd"/>
+            <w:r>
+              <w:rPr>
+                <w:rFonts w:ascii="Arial" w:hAnsi="Arial" w:cs="Arial"/>
+                <w:sz w:val="22"/>
+                <w:szCs w:val="22"/>
+              </w:rPr>
+              <w:t>DigiKicker - Digitalisierung eines Tischfussballtisches</w:t>
+            </w:r>
           </w:p>
         </w:tc>
       </w:tr>
@@ -416,25 +376,7 @@
                 <w:szCs w:val="22"/>
               </w:rPr>
               <w:br/>
-              <w:t>(</w:t>
-            </w:r>
-            <w:proofErr w:type="spellStart"/>
-            <w:r>
-              <w:rPr>
-                <w:rFonts w:ascii="Arial" w:hAnsi="Arial" w:cs="Arial"/>
-                <w:sz w:val="22"/>
-                <w:szCs w:val="22"/>
-              </w:rPr>
-              <w:t>Subthema</w:t>
-            </w:r>
-            <w:proofErr w:type="spellEnd"/>
-            <w:r>
-              <w:rPr>
-                <w:rFonts w:ascii="Arial" w:hAnsi="Arial" w:cs="Arial"/>
-                <w:sz w:val="22"/>
-                <w:szCs w:val="22"/>
-              </w:rPr>
-              <w:t>, Verfasser/in, Klasse)</w:t>
+              <w:t>(Subthema, Verfasser/in, Klasse)</w:t>
             </w:r>
           </w:p>
         </w:tc>
@@ -696,18 +638,8 @@
                 <w:sz w:val="22"/>
                 <w:szCs w:val="22"/>
               </w:rPr>
-              <w:t xml:space="preserve">DI (FH) Günther Hutter, </w:t>
-            </w:r>
-            <w:proofErr w:type="spellStart"/>
-            <w:r>
-              <w:rPr>
-                <w:rFonts w:ascii="Arial" w:hAnsi="Arial" w:cs="Arial"/>
-                <w:sz w:val="22"/>
-                <w:szCs w:val="22"/>
-              </w:rPr>
-              <w:t>MSc</w:t>
-            </w:r>
-            <w:proofErr w:type="spellEnd"/>
+              <w:t>DI (FH) Günther Hutter, MSc</w:t>
+            </w:r>
             <w:r>
               <w:rPr>
                 <w:rFonts w:ascii="Arial" w:hAnsi="Arial" w:cs="Arial"/>
@@ -800,7 +732,7 @@
                 <w:sz w:val="22"/>
                 <w:szCs w:val="22"/>
               </w:rPr>
-              <w:t>Die Schaffung eines funktionierenden Controllers zur Steuerung einer eigens entwickelten Simulation eines Tischfußballtisches, welcher eine Mehrspieler-Funktion aufweist und sowohl on- als auch offline spielbar ist.</w:t>
+              <w:t>Die Schaffung eines funktionierenden Controllers zur Steuerung einer eigens entwickelten Simulation eines Tischfußballtisches, welche eine Mehrspieler-Funktion aufweist und sowohl on- als auch offline spielbar ist.</w:t>
             </w:r>
           </w:p>
           <w:p>
@@ -1058,23 +990,13 @@
                 <w:lang w:val="de-AT"/>
               </w:rPr>
             </w:pPr>
-            <w:proofErr w:type="spellStart"/>
             <w:r>
               <w:rPr>
                 <w:rFonts w:ascii="Arial" w:hAnsi="Arial" w:cs="Arial"/>
                 <w:u w:val="single"/>
                 <w:lang w:val="de-AT"/>
               </w:rPr>
-              <w:t>Lanzmaier</w:t>
-            </w:r>
-            <w:proofErr w:type="spellEnd"/>
-            <w:r>
-              <w:rPr>
-                <w:rFonts w:ascii="Arial" w:hAnsi="Arial" w:cs="Arial"/>
-                <w:u w:val="single"/>
-                <w:lang w:val="de-AT"/>
-              </w:rPr>
-              <w:t>:</w:t>
+              <w:t>Lanzmaier:</w:t>
             </w:r>
             <w:r>
               <w:rPr>
@@ -1842,6 +1764,7 @@
             <w:r>
               <w:rPr>
                 <w:rFonts w:ascii="Arial" w:hAnsi="Arial"/>
+                <w:noProof/>
                 <w:sz w:val="22"/>
                 <w:lang w:val="de-AT"/>
               </w:rPr>
@@ -1943,6 +1866,7 @@
             <w:r>
               <w:rPr>
                 <w:rFonts w:ascii="Arial" w:hAnsi="Arial"/>
+                <w:noProof/>
                 <w:sz w:val="22"/>
                 <w:lang w:val="de-AT"/>
               </w:rPr>
@@ -2012,25 +1936,7 @@
                 <w:sz w:val="22"/>
                 <w:lang w:val="de-AT"/>
               </w:rPr>
-              <w:t xml:space="preserve">Luan </w:t>
-            </w:r>
-            <w:proofErr w:type="spellStart"/>
-            <w:r>
-              <w:rPr>
-                <w:rFonts w:ascii="Arial" w:hAnsi="Arial"/>
-                <w:sz w:val="22"/>
-                <w:lang w:val="de-AT"/>
-              </w:rPr>
-              <w:t>Lanzmaier</w:t>
-            </w:r>
-            <w:proofErr w:type="spellEnd"/>
-            <w:r>
-              <w:rPr>
-                <w:rFonts w:ascii="Arial" w:hAnsi="Arial"/>
-                <w:sz w:val="22"/>
-                <w:lang w:val="de-AT"/>
-              </w:rPr>
-              <w:t>, 5BHWIN</w:t>
+              <w:t>Luan Lanzmaier, 5BHWIN</w:t>
             </w:r>
           </w:p>
         </w:tc>
@@ -2053,6 +1959,7 @@
             <w:r>
               <w:rPr>
                 <w:rFonts w:ascii="Arial" w:hAnsi="Arial"/>
+                <w:noProof/>
                 <w:sz w:val="22"/>
                 <w:lang w:val="de-AT"/>
               </w:rPr>
@@ -2602,19 +2509,8 @@
               <w:sz w:val="22"/>
               <w:szCs w:val="22"/>
             </w:rPr>
-            <w:t xml:space="preserve">Wirtschaftsingenieure – Informationstechnologie und smart </w:t>
+            <w:t>Wirtschaftsingenieure – Informationstechnologie und smart production</w:t>
           </w:r>
-          <w:proofErr w:type="spellStart"/>
-          <w:r>
-            <w:rPr>
-              <w:rFonts w:ascii="Arial" w:hAnsi="Arial" w:cs="Arial"/>
-              <w:b/>
-              <w:sz w:val="22"/>
-              <w:szCs w:val="22"/>
-            </w:rPr>
-            <w:t>production</w:t>
-          </w:r>
-          <w:proofErr w:type="spellEnd"/>
         </w:p>
       </w:tc>
       <w:tc>
@@ -3125,6 +3021,7 @@
   <w:style w:type="character" w:default="1" w:styleId="Absatz-Standardschriftart">
     <w:name w:val="Default Paragraph Font"/>
     <w:uiPriority w:val="1"/>
+    <w:semiHidden/>
     <w:unhideWhenUsed/>
   </w:style>
   <w:style w:type="table" w:default="1" w:styleId="NormaleTabelle">

</xml_diff>